<commit_message>
docs: Update Word report to basic black and white layout with clean borders
</commit_message>
<xml_diff>
--- a/BaoCao_BaiTap_Tuan02_TranBaoAnh.docx
+++ b/BaoCao_BaiTap_Tuan02_TranBaoAnh.docx
@@ -9,16 +9,16 @@
       <w:r>
         <w:rPr>
           <w:b/>
-          <w:color w:val="003366"/>
+          <w:color w:val="000000"/>
           <w:sz w:val="26"/>
         </w:rPr>
-        <w:t>TRƯỜNG ĐẠI HỌC CÔNG THƯƠNG TP. HỒ CHÍ MINH (HUIT)</w:t>
+        <w:t>TRƯỜNG ĐẠI HỌC CÔNG THƯƠNG TP. HỒ CHÍ MINH</w:t>
         <w:br/>
       </w:r>
       <w:r>
         <w:rPr>
           <w:b/>
-          <w:color w:val="464646"/>
+          <w:color w:val="000000"/>
           <w:sz w:val="24"/>
         </w:rPr>
         <w:t>KHOA CÔNG NGHỆ THÔNG TIN – BỘ MÔN KỸ THUẬT PHẦN MỀM</w:t>
@@ -26,7 +26,7 @@
       </w:r>
       <w:r>
         <w:rPr>
-          <w:color w:val="969696"/>
+          <w:color w:val="000000"/>
           <w:sz w:val="22"/>
         </w:rPr>
         <w:t>---------------------------------- *** ----------------------------------</w:t>
@@ -34,14 +34,14 @@
     </w:p>
     <w:p>
       <w:pPr>
-        <w:spacing w:before="200" w:after="240"/>
+        <w:spacing w:before="240" w:after="240"/>
         <w:jc w:val="center"/>
       </w:pPr>
       <w:r>
         <w:rPr>
           <w:b/>
-          <w:color w:val="003366"/>
-          <w:sz w:val="32"/>
+          <w:color w:val="000000"/>
+          <w:sz w:val="30"/>
         </w:rPr>
         <w:t>BÁO CÁO BÀI TẬP THỰC HÀNH TUẦN 02</w:t>
         <w:br/>
@@ -49,8 +49,8 @@
       <w:r>
         <w:rPr>
           <w:b/>
-          <w:color w:val="1F497D"/>
-          <w:sz w:val="28"/>
+          <w:color w:val="000000"/>
+          <w:sz w:val="26"/>
         </w:rPr>
         <w:t>CHỦ ĐỀ: LẬP TRÌNH HƯỚNG ĐỐI TƯỢNG VỚI NGÔN NGỮ DART</w:t>
       </w:r>
@@ -61,6 +61,14 @@
         <w:jc w:val="center"/>
         <w:tblLayout w:type="fixed"/>
         <w:tblLook w:firstColumn="1" w:firstRow="1" w:lastColumn="0" w:lastRow="0" w:noHBand="0" w:noVBand="1" w:val="04A0"/>
+        <w:tblBorders>
+          <w:top w:val="single" w:sz="6" w:space="0" w:color="000000"/>
+          <w:bottom w:val="single" w:sz="6" w:space="0" w:color="000000"/>
+          <w:left w:val="single" w:sz="6" w:space="0" w:color="000000"/>
+          <w:right w:val="single" w:sz="6" w:space="0" w:color="000000"/>
+          <w:insideH w:val="single" w:sz="4" w:space="0" w:color="000000"/>
+          <w:insideV w:val="single" w:sz="4" w:space="0" w:color="000000"/>
+        </w:tblBorders>
       </w:tblPr>
       <w:tblGrid>
         <w:gridCol w:w="4844"/>
@@ -76,15 +84,15 @@
               <w:left w:w="120" w:type="dxa"/>
               <w:right w:w="120" w:type="dxa"/>
             </w:tcMar>
-            <w:shd w:val="clear" w:color="auto" w:fill="F2F4F7"/>
           </w:tcPr>
           <w:p>
             <w:pPr>
-              <w:spacing w:after="40" w:before="40"/>
+              <w:spacing w:after="60" w:before="60"/>
             </w:pPr>
             <w:r>
               <w:rPr>
                 <w:b/>
+                <w:color w:val="000000"/>
                 <w:sz w:val="26"/>
               </w:rPr>
               <w:t>Môn học:</w:t>
@@ -100,14 +108,14 @@
               <w:left w:w="120" w:type="dxa"/>
               <w:right w:w="120" w:type="dxa"/>
             </w:tcMar>
-            <w:shd w:val="clear" w:color="auto" w:fill="FAFAFA"/>
           </w:tcPr>
           <w:p>
             <w:pPr>
-              <w:spacing w:after="40" w:before="40"/>
+              <w:spacing w:after="60" w:before="60"/>
             </w:pPr>
             <w:r>
               <w:rPr>
+                <w:color w:val="000000"/>
                 <w:sz w:val="26"/>
               </w:rPr>
               <w:t>Phát triển ứng dụng di động (PTUDDD)</w:t>
@@ -125,15 +133,15 @@
               <w:left w:w="120" w:type="dxa"/>
               <w:right w:w="120" w:type="dxa"/>
             </w:tcMar>
-            <w:shd w:val="clear" w:color="auto" w:fill="F2F4F7"/>
           </w:tcPr>
           <w:p>
             <w:pPr>
-              <w:spacing w:after="40" w:before="40"/>
+              <w:spacing w:after="60" w:before="60"/>
             </w:pPr>
             <w:r>
               <w:rPr>
                 <w:b/>
+                <w:color w:val="000000"/>
                 <w:sz w:val="26"/>
               </w:rPr>
               <w:t>Họ và tên sinh viên:</w:t>
@@ -149,16 +157,15 @@
               <w:left w:w="120" w:type="dxa"/>
               <w:right w:w="120" w:type="dxa"/>
             </w:tcMar>
-            <w:shd w:val="clear" w:color="auto" w:fill="FAFAFA"/>
           </w:tcPr>
           <w:p>
             <w:pPr>
-              <w:spacing w:after="40" w:before="40"/>
+              <w:spacing w:after="60" w:before="60"/>
             </w:pPr>
             <w:r>
               <w:rPr>
                 <w:b/>
-                <w:color w:val="003366"/>
+                <w:color w:val="000000"/>
                 <w:sz w:val="26"/>
               </w:rPr>
               <w:t>Trần Bảo Anh</w:t>
@@ -176,15 +183,15 @@
               <w:left w:w="120" w:type="dxa"/>
               <w:right w:w="120" w:type="dxa"/>
             </w:tcMar>
-            <w:shd w:val="clear" w:color="auto" w:fill="F2F4F7"/>
           </w:tcPr>
           <w:p>
             <w:pPr>
-              <w:spacing w:after="40" w:before="40"/>
+              <w:spacing w:after="60" w:before="60"/>
             </w:pPr>
             <w:r>
               <w:rPr>
                 <w:b/>
+                <w:color w:val="000000"/>
                 <w:sz w:val="26"/>
               </w:rPr>
               <w:t>Tài khoản GitHub:</w:t>
@@ -200,14 +207,14 @@
               <w:left w:w="120" w:type="dxa"/>
               <w:right w:w="120" w:type="dxa"/>
             </w:tcMar>
-            <w:shd w:val="clear" w:color="auto" w:fill="FAFAFA"/>
           </w:tcPr>
           <w:p>
             <w:pPr>
-              <w:spacing w:after="40" w:before="40"/>
+              <w:spacing w:after="60" w:before="60"/>
             </w:pPr>
             <w:r>
               <w:rPr>
+                <w:color w:val="000000"/>
                 <w:sz w:val="26"/>
               </w:rPr>
               <w:t>BaoAnh109 (Email: anh011009@gmail.com)</w:t>
@@ -225,15 +232,15 @@
               <w:left w:w="120" w:type="dxa"/>
               <w:right w:w="120" w:type="dxa"/>
             </w:tcMar>
-            <w:shd w:val="clear" w:color="auto" w:fill="F2F4F7"/>
           </w:tcPr>
           <w:p>
             <w:pPr>
-              <w:spacing w:after="40" w:before="40"/>
+              <w:spacing w:after="60" w:before="60"/>
             </w:pPr>
             <w:r>
               <w:rPr>
                 <w:b/>
+                <w:color w:val="000000"/>
                 <w:sz w:val="26"/>
               </w:rPr>
               <w:t>Git Repository:</w:t>
@@ -249,11 +256,10 @@
               <w:left w:w="120" w:type="dxa"/>
               <w:right w:w="120" w:type="dxa"/>
             </w:tcMar>
-            <w:shd w:val="clear" w:color="auto" w:fill="FAFAFA"/>
           </w:tcPr>
           <w:p>
             <w:pPr>
-              <w:spacing w:after="40" w:before="40"/>
+              <w:spacing w:after="60" w:before="60"/>
             </w:pPr>
             <w:hyperlink r:id="rId9">
               <w:r>
@@ -261,7 +267,7 @@
                   <w:rFonts w:ascii="Times New Roman" w:hAnsi="Times New Roman"/>
                   <w:sz w:val="26"/>
                   <w:szCs w:val="26"/>
-                  <w:color w:val="004B87"/>
+                  <w:color w:val="000000"/>
                   <w:u w:val="single"/>
                 </w:rPr>
                 <w:t>https://github.com/BaoAnh109/PTUDDD</w:t>
@@ -283,8 +289,8 @@
       <w:r>
         <w:rPr>
           <w:b/>
-          <w:color w:val="003366"/>
-          <w:sz w:val="28"/>
+          <w:color w:val="000000"/>
+          <w:sz w:val="26"/>
         </w:rPr>
         <w:t>TỔNG HỢP CÁC ĐƯỜNG DẪN GIT BÀI TẬP TUẦN 02</w:t>
       </w:r>
@@ -295,6 +301,14 @@
         <w:jc w:val="center"/>
         <w:tblLayout w:type="fixed"/>
         <w:tblLook w:firstColumn="1" w:firstRow="1" w:lastColumn="0" w:lastRow="0" w:noHBand="0" w:noVBand="1" w:val="04A0"/>
+        <w:tblBorders>
+          <w:top w:val="single" w:sz="6" w:space="0" w:color="000000"/>
+          <w:bottom w:val="single" w:sz="6" w:space="0" w:color="000000"/>
+          <w:left w:val="single" w:sz="6" w:space="0" w:color="000000"/>
+          <w:right w:val="single" w:sz="6" w:space="0" w:color="000000"/>
+          <w:insideH w:val="single" w:sz="4" w:space="0" w:color="000000"/>
+          <w:insideV w:val="single" w:sz="4" w:space="0" w:color="000000"/>
+        </w:tblBorders>
       </w:tblPr>
       <w:tblGrid>
         <w:gridCol w:w="2422"/>
@@ -306,23 +320,22 @@
         <w:tc>
           <w:tcPr>
             <w:tcW w:type="dxa" w:w="864"/>
-            <w:shd w:val="clear" w:color="auto" w:fill="1F497D"/>
             <w:tcMar>
-              <w:top w:w="100" w:type="dxa"/>
-              <w:bottom w:w="100" w:type="dxa"/>
-              <w:left w:w="120" w:type="dxa"/>
-              <w:right w:w="120" w:type="dxa"/>
+              <w:top w:w="90" w:type="dxa"/>
+              <w:bottom w:w="90" w:type="dxa"/>
+              <w:left w:w="100" w:type="dxa"/>
+              <w:right w:w="100" w:type="dxa"/>
             </w:tcMar>
           </w:tcPr>
           <w:p>
             <w:pPr>
-              <w:spacing w:after="80" w:before="80"/>
+              <w:spacing w:after="60" w:before="60"/>
               <w:jc w:val="center"/>
             </w:pPr>
             <w:r>
               <w:rPr>
                 <w:b/>
-                <w:color w:val="FFFFFF"/>
+                <w:color w:val="000000"/>
                 <w:sz w:val="24"/>
               </w:rPr>
               <w:t>STT</w:t>
@@ -332,23 +345,22 @@
         <w:tc>
           <w:tcPr>
             <w:tcW w:type="dxa" w:w="3168"/>
-            <w:shd w:val="clear" w:color="auto" w:fill="1F497D"/>
             <w:tcMar>
-              <w:top w:w="100" w:type="dxa"/>
-              <w:bottom w:w="100" w:type="dxa"/>
-              <w:left w:w="120" w:type="dxa"/>
-              <w:right w:w="120" w:type="dxa"/>
+              <w:top w:w="90" w:type="dxa"/>
+              <w:bottom w:w="90" w:type="dxa"/>
+              <w:left w:w="100" w:type="dxa"/>
+              <w:right w:w="100" w:type="dxa"/>
             </w:tcMar>
           </w:tcPr>
           <w:p>
             <w:pPr>
-              <w:spacing w:after="80" w:before="80"/>
+              <w:spacing w:after="60" w:before="60"/>
               <w:jc w:val="center"/>
             </w:pPr>
             <w:r>
               <w:rPr>
                 <w:b/>
-                <w:color w:val="FFFFFF"/>
+                <w:color w:val="000000"/>
                 <w:sz w:val="24"/>
               </w:rPr>
               <w:t>Nội dung bài tập</w:t>
@@ -358,49 +370,47 @@
         <w:tc>
           <w:tcPr>
             <w:tcW w:type="dxa" w:w="1872"/>
-            <w:shd w:val="clear" w:color="auto" w:fill="1F497D"/>
             <w:tcMar>
-              <w:top w:w="100" w:type="dxa"/>
-              <w:bottom w:w="100" w:type="dxa"/>
-              <w:left w:w="120" w:type="dxa"/>
-              <w:right w:w="120" w:type="dxa"/>
+              <w:top w:w="90" w:type="dxa"/>
+              <w:bottom w:w="90" w:type="dxa"/>
+              <w:left w:w="100" w:type="dxa"/>
+              <w:right w:w="100" w:type="dxa"/>
             </w:tcMar>
           </w:tcPr>
           <w:p>
             <w:pPr>
-              <w:spacing w:after="80" w:before="80"/>
+              <w:spacing w:after="60" w:before="60"/>
               <w:jc w:val="center"/>
             </w:pPr>
             <w:r>
               <w:rPr>
                 <w:b/>
-                <w:color w:val="FFFFFF"/>
+                <w:color w:val="000000"/>
                 <w:sz w:val="24"/>
               </w:rPr>
-              <w:t>Thư mục</w:t>
+              <w:t>Thư mục Project</w:t>
             </w:r>
           </w:p>
         </w:tc>
         <w:tc>
           <w:tcPr>
             <w:tcW w:type="dxa" w:w="3312"/>
-            <w:shd w:val="clear" w:color="auto" w:fill="1F497D"/>
             <w:tcMar>
-              <w:top w:w="100" w:type="dxa"/>
-              <w:bottom w:w="100" w:type="dxa"/>
-              <w:left w:w="120" w:type="dxa"/>
-              <w:right w:w="120" w:type="dxa"/>
+              <w:top w:w="90" w:type="dxa"/>
+              <w:bottom w:w="90" w:type="dxa"/>
+              <w:left w:w="100" w:type="dxa"/>
+              <w:right w:w="100" w:type="dxa"/>
             </w:tcMar>
           </w:tcPr>
           <w:p>
             <w:pPr>
-              <w:spacing w:after="80" w:before="80"/>
+              <w:spacing w:after="60" w:before="60"/>
               <w:jc w:val="center"/>
             </w:pPr>
             <w:r>
               <w:rPr>
                 <w:b/>
-                <w:color w:val="FFFFFF"/>
+                <w:color w:val="000000"/>
                 <w:sz w:val="24"/>
               </w:rPr>
               <w:t>Đường dẫn Git trực tiếp</w:t>
@@ -412,12 +422,11 @@
         <w:tc>
           <w:tcPr>
             <w:tcW w:type="dxa" w:w="864"/>
-            <w:shd w:val="clear" w:color="auto" w:fill="F9FAFC"/>
             <w:tcMar>
-              <w:top w:w="80" w:type="dxa"/>
-              <w:bottom w:w="80" w:type="dxa"/>
-              <w:left w:w="100" w:type="dxa"/>
-              <w:right w:w="100" w:type="dxa"/>
+              <w:top w:w="70" w:type="dxa"/>
+              <w:bottom w:w="70" w:type="dxa"/>
+              <w:left w:w="90" w:type="dxa"/>
+              <w:right w:w="90" w:type="dxa"/>
             </w:tcMar>
           </w:tcPr>
           <w:p>
@@ -427,6 +436,7 @@
             </w:pPr>
             <w:r>
               <w:rPr>
+                <w:color w:val="000000"/>
                 <w:sz w:val="24"/>
               </w:rPr>
               <w:t>1</w:t>
@@ -436,12 +446,11 @@
         <w:tc>
           <w:tcPr>
             <w:tcW w:type="dxa" w:w="3168"/>
-            <w:shd w:val="clear" w:color="auto" w:fill="F9FAFC"/>
             <w:tcMar>
-              <w:top w:w="80" w:type="dxa"/>
-              <w:bottom w:w="80" w:type="dxa"/>
-              <w:left w:w="100" w:type="dxa"/>
-              <w:right w:w="100" w:type="dxa"/>
+              <w:top w:w="70" w:type="dxa"/>
+              <w:bottom w:w="70" w:type="dxa"/>
+              <w:left w:w="90" w:type="dxa"/>
+              <w:right w:w="90" w:type="dxa"/>
             </w:tcMar>
           </w:tcPr>
           <w:p>
@@ -450,6 +459,7 @@
             </w:pPr>
             <w:r>
               <w:rPr>
+                <w:color w:val="000000"/>
                 <w:sz w:val="24"/>
               </w:rPr>
               <w:t>Bài 1: Quản lý Nhân viên &amp; Cán bộ</w:t>
@@ -459,12 +469,11 @@
         <w:tc>
           <w:tcPr>
             <w:tcW w:type="dxa" w:w="1872"/>
-            <w:shd w:val="clear" w:color="auto" w:fill="F9FAFC"/>
             <w:tcMar>
-              <w:top w:w="80" w:type="dxa"/>
-              <w:bottom w:w="80" w:type="dxa"/>
-              <w:left w:w="100" w:type="dxa"/>
-              <w:right w:w="100" w:type="dxa"/>
+              <w:top w:w="70" w:type="dxa"/>
+              <w:bottom w:w="70" w:type="dxa"/>
+              <w:left w:w="90" w:type="dxa"/>
+              <w:right w:w="90" w:type="dxa"/>
             </w:tcMar>
           </w:tcPr>
           <w:p>
@@ -473,6 +482,7 @@
             </w:pPr>
             <w:r>
               <w:rPr>
+                <w:color w:val="000000"/>
                 <w:sz w:val="24"/>
               </w:rPr>
               <w:t>ql_nhan_vien</w:t>
@@ -482,12 +492,11 @@
         <w:tc>
           <w:tcPr>
             <w:tcW w:type="dxa" w:w="3312"/>
-            <w:shd w:val="clear" w:color="auto" w:fill="F9FAFC"/>
             <w:tcMar>
-              <w:top w:w="80" w:type="dxa"/>
-              <w:bottom w:w="80" w:type="dxa"/>
-              <w:left w:w="100" w:type="dxa"/>
-              <w:right w:w="100" w:type="dxa"/>
+              <w:top w:w="70" w:type="dxa"/>
+              <w:bottom w:w="70" w:type="dxa"/>
+              <w:left w:w="90" w:type="dxa"/>
+              <w:right w:w="90" w:type="dxa"/>
             </w:tcMar>
           </w:tcPr>
           <w:p>
@@ -498,12 +507,12 @@
               <w:r>
                 <w:rPr>
                   <w:rFonts w:ascii="Times New Roman" w:hAnsi="Times New Roman"/>
-                  <w:sz w:val="24"/>
-                  <w:szCs w:val="24"/>
-                  <w:color w:val="004B87"/>
+                  <w:sz w:val="22"/>
+                  <w:szCs w:val="22"/>
+                  <w:color w:val="000000"/>
                   <w:u w:val="single"/>
                 </w:rPr>
-                <w:t>Xem trên GitHub</w:t>
+                <w:t>https://github.com/BaoAnh109/PTUDDD/tree/main/Tuan02/ql_nhan_vien</w:t>
               </w:r>
             </w:hyperlink>
           </w:p>
@@ -513,12 +522,11 @@
         <w:tc>
           <w:tcPr>
             <w:tcW w:type="dxa" w:w="864"/>
-            <w:shd w:val="clear" w:color="auto" w:fill="FFFFFF"/>
             <w:tcMar>
-              <w:top w:w="80" w:type="dxa"/>
-              <w:bottom w:w="80" w:type="dxa"/>
-              <w:left w:w="100" w:type="dxa"/>
-              <w:right w:w="100" w:type="dxa"/>
+              <w:top w:w="70" w:type="dxa"/>
+              <w:bottom w:w="70" w:type="dxa"/>
+              <w:left w:w="90" w:type="dxa"/>
+              <w:right w:w="90" w:type="dxa"/>
             </w:tcMar>
           </w:tcPr>
           <w:p>
@@ -528,6 +536,7 @@
             </w:pPr>
             <w:r>
               <w:rPr>
+                <w:color w:val="000000"/>
                 <w:sz w:val="24"/>
               </w:rPr>
               <w:t>2</w:t>
@@ -537,12 +546,11 @@
         <w:tc>
           <w:tcPr>
             <w:tcW w:type="dxa" w:w="3168"/>
-            <w:shd w:val="clear" w:color="auto" w:fill="FFFFFF"/>
             <w:tcMar>
-              <w:top w:w="80" w:type="dxa"/>
-              <w:bottom w:w="80" w:type="dxa"/>
-              <w:left w:w="100" w:type="dxa"/>
-              <w:right w:w="100" w:type="dxa"/>
+              <w:top w:w="70" w:type="dxa"/>
+              <w:bottom w:w="70" w:type="dxa"/>
+              <w:left w:w="90" w:type="dxa"/>
+              <w:right w:w="90" w:type="dxa"/>
             </w:tcMar>
           </w:tcPr>
           <w:p>
@@ -551,6 +559,7 @@
             </w:pPr>
             <w:r>
               <w:rPr>
+                <w:color w:val="000000"/>
                 <w:sz w:val="24"/>
               </w:rPr>
               <w:t>Bài 2: Quản lý Sản phẩm (Đọc file)</w:t>
@@ -560,12 +569,11 @@
         <w:tc>
           <w:tcPr>
             <w:tcW w:type="dxa" w:w="1872"/>
-            <w:shd w:val="clear" w:color="auto" w:fill="FFFFFF"/>
             <w:tcMar>
-              <w:top w:w="80" w:type="dxa"/>
-              <w:bottom w:w="80" w:type="dxa"/>
-              <w:left w:w="100" w:type="dxa"/>
-              <w:right w:w="100" w:type="dxa"/>
+              <w:top w:w="70" w:type="dxa"/>
+              <w:bottom w:w="70" w:type="dxa"/>
+              <w:left w:w="90" w:type="dxa"/>
+              <w:right w:w="90" w:type="dxa"/>
             </w:tcMar>
           </w:tcPr>
           <w:p>
@@ -574,6 +582,7 @@
             </w:pPr>
             <w:r>
               <w:rPr>
+                <w:color w:val="000000"/>
                 <w:sz w:val="24"/>
               </w:rPr>
               <w:t>ql_san_pham</w:t>
@@ -583,12 +592,11 @@
         <w:tc>
           <w:tcPr>
             <w:tcW w:type="dxa" w:w="3312"/>
-            <w:shd w:val="clear" w:color="auto" w:fill="FFFFFF"/>
             <w:tcMar>
-              <w:top w:w="80" w:type="dxa"/>
-              <w:bottom w:w="80" w:type="dxa"/>
-              <w:left w:w="100" w:type="dxa"/>
-              <w:right w:w="100" w:type="dxa"/>
+              <w:top w:w="70" w:type="dxa"/>
+              <w:bottom w:w="70" w:type="dxa"/>
+              <w:left w:w="90" w:type="dxa"/>
+              <w:right w:w="90" w:type="dxa"/>
             </w:tcMar>
           </w:tcPr>
           <w:p>
@@ -599,12 +607,12 @@
               <w:r>
                 <w:rPr>
                   <w:rFonts w:ascii="Times New Roman" w:hAnsi="Times New Roman"/>
-                  <w:sz w:val="24"/>
-                  <w:szCs w:val="24"/>
-                  <w:color w:val="004B87"/>
+                  <w:sz w:val="22"/>
+                  <w:szCs w:val="22"/>
+                  <w:color w:val="000000"/>
                   <w:u w:val="single"/>
                 </w:rPr>
-                <w:t>Xem trên GitHub</w:t>
+                <w:t>https://github.com/BaoAnh109/PTUDDD/tree/main/Tuan02/ql_san_pham</w:t>
               </w:r>
             </w:hyperlink>
           </w:p>
@@ -614,12 +622,11 @@
         <w:tc>
           <w:tcPr>
             <w:tcW w:type="dxa" w:w="864"/>
-            <w:shd w:val="clear" w:color="auto" w:fill="F9FAFC"/>
             <w:tcMar>
-              <w:top w:w="80" w:type="dxa"/>
-              <w:bottom w:w="80" w:type="dxa"/>
-              <w:left w:w="100" w:type="dxa"/>
-              <w:right w:w="100" w:type="dxa"/>
+              <w:top w:w="70" w:type="dxa"/>
+              <w:bottom w:w="70" w:type="dxa"/>
+              <w:left w:w="90" w:type="dxa"/>
+              <w:right w:w="90" w:type="dxa"/>
             </w:tcMar>
           </w:tcPr>
           <w:p>
@@ -629,6 +636,7 @@
             </w:pPr>
             <w:r>
               <w:rPr>
+                <w:color w:val="000000"/>
                 <w:sz w:val="24"/>
               </w:rPr>
               <w:t>3</w:t>
@@ -638,12 +646,11 @@
         <w:tc>
           <w:tcPr>
             <w:tcW w:type="dxa" w:w="3168"/>
-            <w:shd w:val="clear" w:color="auto" w:fill="F9FAFC"/>
             <w:tcMar>
-              <w:top w:w="80" w:type="dxa"/>
-              <w:bottom w:w="80" w:type="dxa"/>
-              <w:left w:w="100" w:type="dxa"/>
-              <w:right w:w="100" w:type="dxa"/>
+              <w:top w:w="70" w:type="dxa"/>
+              <w:bottom w:w="70" w:type="dxa"/>
+              <w:left w:w="90" w:type="dxa"/>
+              <w:right w:w="90" w:type="dxa"/>
             </w:tcMar>
           </w:tcPr>
           <w:p>
@@ -652,6 +659,7 @@
             </w:pPr>
             <w:r>
               <w:rPr>
+                <w:color w:val="000000"/>
                 <w:sz w:val="24"/>
               </w:rPr>
               <w:t>Bài 3: Quản lý Nhà trọ (Tự làm 1)</w:t>
@@ -661,12 +669,11 @@
         <w:tc>
           <w:tcPr>
             <w:tcW w:type="dxa" w:w="1872"/>
-            <w:shd w:val="clear" w:color="auto" w:fill="F9FAFC"/>
             <w:tcMar>
-              <w:top w:w="80" w:type="dxa"/>
-              <w:bottom w:w="80" w:type="dxa"/>
-              <w:left w:w="100" w:type="dxa"/>
-              <w:right w:w="100" w:type="dxa"/>
+              <w:top w:w="70" w:type="dxa"/>
+              <w:bottom w:w="70" w:type="dxa"/>
+              <w:left w:w="90" w:type="dxa"/>
+              <w:right w:w="90" w:type="dxa"/>
             </w:tcMar>
           </w:tcPr>
           <w:p>
@@ -675,6 +682,7 @@
             </w:pPr>
             <w:r>
               <w:rPr>
+                <w:color w:val="000000"/>
                 <w:sz w:val="24"/>
               </w:rPr>
               <w:t>ql_nha_tro</w:t>
@@ -684,12 +692,11 @@
         <w:tc>
           <w:tcPr>
             <w:tcW w:type="dxa" w:w="3312"/>
-            <w:shd w:val="clear" w:color="auto" w:fill="F9FAFC"/>
             <w:tcMar>
-              <w:top w:w="80" w:type="dxa"/>
-              <w:bottom w:w="80" w:type="dxa"/>
-              <w:left w:w="100" w:type="dxa"/>
-              <w:right w:w="100" w:type="dxa"/>
+              <w:top w:w="70" w:type="dxa"/>
+              <w:bottom w:w="70" w:type="dxa"/>
+              <w:left w:w="90" w:type="dxa"/>
+              <w:right w:w="90" w:type="dxa"/>
             </w:tcMar>
           </w:tcPr>
           <w:p>
@@ -700,12 +707,12 @@
               <w:r>
                 <w:rPr>
                   <w:rFonts w:ascii="Times New Roman" w:hAnsi="Times New Roman"/>
-                  <w:sz w:val="24"/>
-                  <w:szCs w:val="24"/>
-                  <w:color w:val="004B87"/>
+                  <w:sz w:val="22"/>
+                  <w:szCs w:val="22"/>
+                  <w:color w:val="000000"/>
                   <w:u w:val="single"/>
                 </w:rPr>
-                <w:t>Xem trên GitHub</w:t>
+                <w:t>https://github.com/BaoAnh109/PTUDDD/tree/main/Tuan02/ql_nha_tro</w:t>
               </w:r>
             </w:hyperlink>
           </w:p>
@@ -715,12 +722,11 @@
         <w:tc>
           <w:tcPr>
             <w:tcW w:type="dxa" w:w="864"/>
-            <w:shd w:val="clear" w:color="auto" w:fill="FFFFFF"/>
             <w:tcMar>
-              <w:top w:w="80" w:type="dxa"/>
-              <w:bottom w:w="80" w:type="dxa"/>
-              <w:left w:w="100" w:type="dxa"/>
-              <w:right w:w="100" w:type="dxa"/>
+              <w:top w:w="70" w:type="dxa"/>
+              <w:bottom w:w="70" w:type="dxa"/>
+              <w:left w:w="90" w:type="dxa"/>
+              <w:right w:w="90" w:type="dxa"/>
             </w:tcMar>
           </w:tcPr>
           <w:p>
@@ -730,6 +736,7 @@
             </w:pPr>
             <w:r>
               <w:rPr>
+                <w:color w:val="000000"/>
                 <w:sz w:val="24"/>
               </w:rPr>
               <w:t>4</w:t>
@@ -739,12 +746,11 @@
         <w:tc>
           <w:tcPr>
             <w:tcW w:type="dxa" w:w="3168"/>
-            <w:shd w:val="clear" w:color="auto" w:fill="FFFFFF"/>
             <w:tcMar>
-              <w:top w:w="80" w:type="dxa"/>
-              <w:bottom w:w="80" w:type="dxa"/>
-              <w:left w:w="100" w:type="dxa"/>
-              <w:right w:w="100" w:type="dxa"/>
+              <w:top w:w="70" w:type="dxa"/>
+              <w:bottom w:w="70" w:type="dxa"/>
+              <w:left w:w="90" w:type="dxa"/>
+              <w:right w:w="90" w:type="dxa"/>
             </w:tcMar>
           </w:tcPr>
           <w:p>
@@ -753,6 +759,7 @@
             </w:pPr>
             <w:r>
               <w:rPr>
+                <w:color w:val="000000"/>
                 <w:sz w:val="24"/>
               </w:rPr>
               <w:t>Bài 4: Quản lý Môn học (Tự làm 2)</w:t>
@@ -762,12 +769,11 @@
         <w:tc>
           <w:tcPr>
             <w:tcW w:type="dxa" w:w="1872"/>
-            <w:shd w:val="clear" w:color="auto" w:fill="FFFFFF"/>
             <w:tcMar>
-              <w:top w:w="80" w:type="dxa"/>
-              <w:bottom w:w="80" w:type="dxa"/>
-              <w:left w:w="100" w:type="dxa"/>
-              <w:right w:w="100" w:type="dxa"/>
+              <w:top w:w="70" w:type="dxa"/>
+              <w:bottom w:w="70" w:type="dxa"/>
+              <w:left w:w="90" w:type="dxa"/>
+              <w:right w:w="90" w:type="dxa"/>
             </w:tcMar>
           </w:tcPr>
           <w:p>
@@ -776,6 +782,7 @@
             </w:pPr>
             <w:r>
               <w:rPr>
+                <w:color w:val="000000"/>
                 <w:sz w:val="24"/>
               </w:rPr>
               <w:t>ql_mon_hoc</w:t>
@@ -785,12 +792,11 @@
         <w:tc>
           <w:tcPr>
             <w:tcW w:type="dxa" w:w="3312"/>
-            <w:shd w:val="clear" w:color="auto" w:fill="FFFFFF"/>
             <w:tcMar>
-              <w:top w:w="80" w:type="dxa"/>
-              <w:bottom w:w="80" w:type="dxa"/>
-              <w:left w:w="100" w:type="dxa"/>
-              <w:right w:w="100" w:type="dxa"/>
+              <w:top w:w="70" w:type="dxa"/>
+              <w:bottom w:w="70" w:type="dxa"/>
+              <w:left w:w="90" w:type="dxa"/>
+              <w:right w:w="90" w:type="dxa"/>
             </w:tcMar>
           </w:tcPr>
           <w:p>
@@ -801,12 +807,12 @@
               <w:r>
                 <w:rPr>
                   <w:rFonts w:ascii="Times New Roman" w:hAnsi="Times New Roman"/>
-                  <w:sz w:val="24"/>
-                  <w:szCs w:val="24"/>
-                  <w:color w:val="004B87"/>
+                  <w:sz w:val="22"/>
+                  <w:szCs w:val="22"/>
+                  <w:color w:val="000000"/>
                   <w:u w:val="single"/>
                 </w:rPr>
-                <w:t>Xem trên GitHub</w:t>
+                <w:t>https://github.com/BaoAnh109/PTUDDD/tree/main/Tuan02/ql_mon_hoc</w:t>
               </w:r>
             </w:hyperlink>
           </w:p>
@@ -816,12 +822,11 @@
         <w:tc>
           <w:tcPr>
             <w:tcW w:type="dxa" w:w="864"/>
-            <w:shd w:val="clear" w:color="auto" w:fill="F9FAFC"/>
             <w:tcMar>
-              <w:top w:w="80" w:type="dxa"/>
-              <w:bottom w:w="80" w:type="dxa"/>
-              <w:left w:w="100" w:type="dxa"/>
-              <w:right w:w="100" w:type="dxa"/>
+              <w:top w:w="70" w:type="dxa"/>
+              <w:bottom w:w="70" w:type="dxa"/>
+              <w:left w:w="90" w:type="dxa"/>
+              <w:right w:w="90" w:type="dxa"/>
             </w:tcMar>
           </w:tcPr>
           <w:p>
@@ -831,6 +836,7 @@
             </w:pPr>
             <w:r>
               <w:rPr>
+                <w:color w:val="000000"/>
                 <w:sz w:val="24"/>
               </w:rPr>
               <w:t>5</w:t>
@@ -840,12 +846,11 @@
         <w:tc>
           <w:tcPr>
             <w:tcW w:type="dxa" w:w="3168"/>
-            <w:shd w:val="clear" w:color="auto" w:fill="F9FAFC"/>
             <w:tcMar>
-              <w:top w:w="80" w:type="dxa"/>
-              <w:bottom w:w="80" w:type="dxa"/>
-              <w:left w:w="100" w:type="dxa"/>
-              <w:right w:w="100" w:type="dxa"/>
+              <w:top w:w="70" w:type="dxa"/>
+              <w:bottom w:w="70" w:type="dxa"/>
+              <w:left w:w="90" w:type="dxa"/>
+              <w:right w:w="90" w:type="dxa"/>
             </w:tcMar>
           </w:tcPr>
           <w:p>
@@ -854,6 +859,7 @@
             </w:pPr>
             <w:r>
               <w:rPr>
+                <w:color w:val="000000"/>
                 <w:sz w:val="24"/>
               </w:rPr>
               <w:t>Bài 5: Quản lý Hóa đơn ABC (Về nhà)</w:t>
@@ -863,12 +869,11 @@
         <w:tc>
           <w:tcPr>
             <w:tcW w:type="dxa" w:w="1872"/>
-            <w:shd w:val="clear" w:color="auto" w:fill="F9FAFC"/>
             <w:tcMar>
-              <w:top w:w="80" w:type="dxa"/>
-              <w:bottom w:w="80" w:type="dxa"/>
-              <w:left w:w="100" w:type="dxa"/>
-              <w:right w:w="100" w:type="dxa"/>
+              <w:top w:w="70" w:type="dxa"/>
+              <w:bottom w:w="70" w:type="dxa"/>
+              <w:left w:w="90" w:type="dxa"/>
+              <w:right w:w="90" w:type="dxa"/>
             </w:tcMar>
           </w:tcPr>
           <w:p>
@@ -877,6 +882,7 @@
             </w:pPr>
             <w:r>
               <w:rPr>
+                <w:color w:val="000000"/>
                 <w:sz w:val="24"/>
               </w:rPr>
               <w:t>ql_congty_abc</w:t>
@@ -886,12 +892,11 @@
         <w:tc>
           <w:tcPr>
             <w:tcW w:type="dxa" w:w="3312"/>
-            <w:shd w:val="clear" w:color="auto" w:fill="F9FAFC"/>
             <w:tcMar>
-              <w:top w:w="80" w:type="dxa"/>
-              <w:bottom w:w="80" w:type="dxa"/>
-              <w:left w:w="100" w:type="dxa"/>
-              <w:right w:w="100" w:type="dxa"/>
+              <w:top w:w="70" w:type="dxa"/>
+              <w:bottom w:w="70" w:type="dxa"/>
+              <w:left w:w="90" w:type="dxa"/>
+              <w:right w:w="90" w:type="dxa"/>
             </w:tcMar>
           </w:tcPr>
           <w:p>
@@ -902,12 +907,12 @@
               <w:r>
                 <w:rPr>
                   <w:rFonts w:ascii="Times New Roman" w:hAnsi="Times New Roman"/>
-                  <w:sz w:val="24"/>
-                  <w:szCs w:val="24"/>
-                  <w:color w:val="004B87"/>
+                  <w:sz w:val="22"/>
+                  <w:szCs w:val="22"/>
+                  <w:color w:val="000000"/>
                   <w:u w:val="single"/>
                 </w:rPr>
-                <w:t>Xem trên GitHub</w:t>
+                <w:t>https://github.com/BaoAnh109/PTUDDD/tree/main/Tuan02/ql_congty_abc</w:t>
               </w:r>
             </w:hyperlink>
           </w:p>
@@ -916,29 +921,30 @@
     </w:tbl>
     <w:p>
       <w:pPr>
-        <w:spacing w:after="200"/>
+        <w:spacing w:after="160"/>
       </w:pPr>
     </w:p>
     <w:p>
       <w:pPr>
-        <w:spacing w:before="320" w:after="80"/>
+        <w:spacing w:before="280" w:after="80"/>
       </w:pPr>
       <w:r>
         <w:rPr>
           <w:b/>
-          <w:color w:val="003366"/>
-          <w:sz w:val="28"/>
+          <w:color w:val="000000"/>
+          <w:sz w:val="26"/>
         </w:rPr>
         <w:t>I. BÀI TẬP 1: QUẢN LÝ NHÂN VIÊN VÀ CÁN BỘ (ql_nhan_vien)</w:t>
       </w:r>
     </w:p>
     <w:p>
       <w:pPr>
-        <w:spacing w:before="0" w:after="80"/>
+        <w:spacing w:before="0" w:after="60"/>
       </w:pPr>
       <w:r>
         <w:rPr>
           <w:b/>
+          <w:color w:val="000000"/>
           <w:sz w:val="26"/>
         </w:rPr>
         <w:t xml:space="preserve">• Đường dẫn Git: </w:t>
@@ -949,7 +955,7 @@
             <w:rFonts w:ascii="Times New Roman" w:hAnsi="Times New Roman"/>
             <w:sz w:val="26"/>
             <w:szCs w:val="26"/>
-            <w:color w:val="004B87"/>
+            <w:color w:val="000000"/>
             <w:u w:val="single"/>
           </w:rPr>
           <w:t>https://github.com/BaoAnh109/PTUDDD/tree/main/Tuan02/ql_nhan_vien</w:t>
@@ -963,12 +969,14 @@
       <w:r>
         <w:rPr>
           <w:b/>
+          <w:color w:val="000000"/>
           <w:sz w:val="26"/>
         </w:rPr>
         <w:t xml:space="preserve">• Tóm tắt yêu cầu: </w:t>
       </w:r>
       <w:r>
         <w:rPr>
+          <w:color w:val="000000"/>
           <w:sz w:val="26"/>
         </w:rPr>
         <w:t>Xây dựng lớp Nhanvien và lớp kế thừa CanBo. Cung cấp các phương thức khởi tạo, xếp loại theo số ngày làm việc, tính lương dựa trên hệ số lương, hệ số thi đua và phụ cấp chức vụ. Quản lý danh sách nhân viên, lọc nhân viên loại A.</w:t>
@@ -981,7 +989,7 @@
       <w:r>
         <w:rPr>
           <w:b/>
-          <w:color w:val="1F497D"/>
+          <w:color w:val="000000"/>
           <w:sz w:val="26"/>
         </w:rPr>
         <w:t>1.1. Source Code: lib/NhanVien.dart (Lớp Nhân viên)</w:t>
@@ -989,13 +997,13 @@
     </w:p>
     <w:p>
       <w:pPr>
-        <w:spacing w:before="40" w:after="160"/>
+        <w:spacing w:before="40" w:after="120"/>
         <w:jc w:val="center"/>
       </w:pPr>
       <w:r>
         <w:drawing>
           <wp:inline xmlns:a="http://schemas.openxmlformats.org/drawingml/2006/main" xmlns:pic="http://schemas.openxmlformats.org/drawingml/2006/picture">
-            <wp:extent cx="5669280" cy="8676463"/>
+            <wp:extent cx="5669280" cy="8793683"/>
             <wp:docPr id="1" name="Picture 1"/>
             <wp:cNvGraphicFramePr>
               <a:graphicFrameLocks noChangeAspect="1"/>
@@ -1016,7 +1024,7 @@
                   <pic:spPr>
                     <a:xfrm>
                       <a:off x="0" y="0"/>
-                      <a:ext cx="5669280" cy="8676463"/>
+                      <a:ext cx="5669280" cy="8793683"/>
                     </a:xfrm>
                     <a:prstGeom prst="rect"/>
                   </pic:spPr>
@@ -1034,7 +1042,7 @@
       <w:r>
         <w:rPr>
           <w:b/>
-          <w:color w:val="1F497D"/>
+          <w:color w:val="000000"/>
           <w:sz w:val="26"/>
         </w:rPr>
         <w:t>1.2. Source Code: lib/CanBo.dart (Lớp Cán bộ kế thừa)</w:t>
@@ -1042,13 +1050,13 @@
     </w:p>
     <w:p>
       <w:pPr>
-        <w:spacing w:before="40" w:after="160"/>
+        <w:spacing w:before="40" w:after="120"/>
         <w:jc w:val="center"/>
       </w:pPr>
       <w:r>
         <w:drawing>
           <wp:inline xmlns:a="http://schemas.openxmlformats.org/drawingml/2006/main" xmlns:pic="http://schemas.openxmlformats.org/drawingml/2006/picture">
-            <wp:extent cx="5669280" cy="4239635"/>
+            <wp:extent cx="5669280" cy="4258259"/>
             <wp:docPr id="2" name="Picture 2"/>
             <wp:cNvGraphicFramePr>
               <a:graphicFrameLocks noChangeAspect="1"/>
@@ -1069,7 +1077,7 @@
                   <pic:spPr>
                     <a:xfrm>
                       <a:off x="0" y="0"/>
-                      <a:ext cx="5669280" cy="4239635"/>
+                      <a:ext cx="5669280" cy="4258259"/>
                     </a:xfrm>
                     <a:prstGeom prst="rect"/>
                   </pic:spPr>
@@ -1087,7 +1095,7 @@
       <w:r>
         <w:rPr>
           <w:b/>
-          <w:color w:val="1F497D"/>
+          <w:color w:val="000000"/>
           <w:sz w:val="26"/>
         </w:rPr>
         <w:t>1.3. Source Code: bin/ql_nhan_vien.dart (Chương trình chính)</w:t>
@@ -1095,13 +1103,13 @@
     </w:p>
     <w:p>
       <w:pPr>
-        <w:spacing w:before="40" w:after="160"/>
+        <w:spacing w:before="40" w:after="120"/>
         <w:jc w:val="center"/>
       </w:pPr>
       <w:r>
         <w:drawing>
           <wp:inline xmlns:a="http://schemas.openxmlformats.org/drawingml/2006/main" xmlns:pic="http://schemas.openxmlformats.org/drawingml/2006/picture">
-            <wp:extent cx="5669280" cy="6014367"/>
+            <wp:extent cx="5669280" cy="6072429"/>
             <wp:docPr id="3" name="Picture 3"/>
             <wp:cNvGraphicFramePr>
               <a:graphicFrameLocks noChangeAspect="1"/>
@@ -1122,7 +1130,7 @@
                   <pic:spPr>
                     <a:xfrm>
                       <a:off x="0" y="0"/>
-                      <a:ext cx="5669280" cy="6014367"/>
+                      <a:ext cx="5669280" cy="6072429"/>
                     </a:xfrm>
                     <a:prstGeom prst="rect"/>
                   </pic:spPr>
@@ -1140,7 +1148,7 @@
       <w:r>
         <w:rPr>
           <w:b/>
-          <w:color w:val="1F497D"/>
+          <w:color w:val="000000"/>
           <w:sz w:val="26"/>
         </w:rPr>
         <w:t>1.4. Kết quả thực thi chương trình Bài 1</w:t>
@@ -1148,13 +1156,13 @@
     </w:p>
     <w:p>
       <w:pPr>
-        <w:spacing w:before="40" w:after="160"/>
+        <w:spacing w:before="40" w:after="120"/>
         <w:jc w:val="center"/>
       </w:pPr>
       <w:r>
         <w:drawing>
           <wp:inline xmlns:a="http://schemas.openxmlformats.org/drawingml/2006/main" xmlns:pic="http://schemas.openxmlformats.org/drawingml/2006/picture">
-            <wp:extent cx="5669280" cy="1577539"/>
+            <wp:extent cx="5669280" cy="1537005"/>
             <wp:docPr id="4" name="Picture 4"/>
             <wp:cNvGraphicFramePr>
               <a:graphicFrameLocks noChangeAspect="1"/>
@@ -1175,7 +1183,7 @@
                   <pic:spPr>
                     <a:xfrm>
                       <a:off x="0" y="0"/>
-                      <a:ext cx="5669280" cy="1577539"/>
+                      <a:ext cx="5669280" cy="1537005"/>
                     </a:xfrm>
                     <a:prstGeom prst="rect"/>
                   </pic:spPr>
@@ -1188,24 +1196,25 @@
     </w:p>
     <w:p>
       <w:pPr>
-        <w:spacing w:before="320" w:after="80"/>
+        <w:spacing w:before="280" w:after="80"/>
       </w:pPr>
       <w:r>
         <w:rPr>
           <w:b/>
-          <w:color w:val="003366"/>
-          <w:sz w:val="28"/>
+          <w:color w:val="000000"/>
+          <w:sz w:val="26"/>
         </w:rPr>
         <w:t>II. BÀI TẬP 2: QUẢN LÝ SẢN PHẨM – ĐỌC FILE (ql_san_pham)</w:t>
       </w:r>
     </w:p>
     <w:p>
       <w:pPr>
-        <w:spacing w:before="0" w:after="80"/>
+        <w:spacing w:before="0" w:after="60"/>
       </w:pPr>
       <w:r>
         <w:rPr>
           <w:b/>
+          <w:color w:val="000000"/>
           <w:sz w:val="26"/>
         </w:rPr>
         <w:t xml:space="preserve">• Đường dẫn Git: </w:t>
@@ -1216,7 +1225,7 @@
             <w:rFonts w:ascii="Times New Roman" w:hAnsi="Times New Roman"/>
             <w:sz w:val="26"/>
             <w:szCs w:val="26"/>
-            <w:color w:val="004B87"/>
+            <w:color w:val="000000"/>
             <w:u w:val="single"/>
           </w:rPr>
           <w:t>https://github.com/BaoAnh109/PTUDDD/tree/main/Tuan02/ql_san_pham</w:t>
@@ -1230,12 +1239,14 @@
       <w:r>
         <w:rPr>
           <w:b/>
+          <w:color w:val="000000"/>
           <w:sz w:val="26"/>
         </w:rPr>
         <w:t xml:space="preserve">• Tóm tắt yêu cầu: </w:t>
       </w:r>
       <w:r>
         <w:rPr>
+          <w:color w:val="000000"/>
           <w:sz w:val="26"/>
         </w:rPr>
         <w:t>Xây dựng lớp SanPham với các thuộc tính mã SP, tên SP, đơn giá, giảm giá. Đọc danh sách sản phẩm bất đồng bộ từ file text (SanPham.txt) bằng Future&lt;List&lt;SanPham&gt;&gt;, phân tách dữ liệu bằng ký tự phân cách '#' và hiển thị thông tin.</w:t>
@@ -1248,7 +1259,7 @@
       <w:r>
         <w:rPr>
           <w:b/>
-          <w:color w:val="1F497D"/>
+          <w:color w:val="000000"/>
           <w:sz w:val="26"/>
         </w:rPr>
         <w:t>2.1. Source Code: lib/ql_san_pham.dart (Lớp Sản phẩm)</w:t>
@@ -1256,13 +1267,13 @@
     </w:p>
     <w:p>
       <w:pPr>
-        <w:spacing w:before="40" w:after="160"/>
+        <w:spacing w:before="40" w:after="120"/>
         <w:jc w:val="center"/>
       </w:pPr>
       <w:r>
         <w:drawing>
           <wp:inline xmlns:a="http://schemas.openxmlformats.org/drawingml/2006/main" xmlns:pic="http://schemas.openxmlformats.org/drawingml/2006/picture">
-            <wp:extent cx="5669280" cy="7789098"/>
+            <wp:extent cx="5669280" cy="7886598"/>
             <wp:docPr id="5" name="Picture 5"/>
             <wp:cNvGraphicFramePr>
               <a:graphicFrameLocks noChangeAspect="1"/>
@@ -1283,7 +1294,7 @@
                   <pic:spPr>
                     <a:xfrm>
                       <a:off x="0" y="0"/>
-                      <a:ext cx="5669280" cy="7789098"/>
+                      <a:ext cx="5669280" cy="7886598"/>
                     </a:xfrm>
                     <a:prstGeom prst="rect"/>
                   </pic:spPr>
@@ -1301,7 +1312,7 @@
       <w:r>
         <w:rPr>
           <w:b/>
-          <w:color w:val="1F497D"/>
+          <w:color w:val="000000"/>
           <w:sz w:val="26"/>
         </w:rPr>
         <w:t>2.2. Source Code: lib/docFile.dart (Hàm đọc file bất đồng bộ)</w:t>
@@ -1309,13 +1320,13 @@
     </w:p>
     <w:p>
       <w:pPr>
-        <w:spacing w:before="40" w:after="160"/>
+        <w:spacing w:before="40" w:after="120"/>
         <w:jc w:val="center"/>
       </w:pPr>
       <w:r>
         <w:drawing>
           <wp:inline xmlns:a="http://schemas.openxmlformats.org/drawingml/2006/main" xmlns:pic="http://schemas.openxmlformats.org/drawingml/2006/picture">
-            <wp:extent cx="5669280" cy="4091741"/>
+            <wp:extent cx="5669280" cy="4107078"/>
             <wp:docPr id="6" name="Picture 6"/>
             <wp:cNvGraphicFramePr>
               <a:graphicFrameLocks noChangeAspect="1"/>
@@ -1336,7 +1347,7 @@
                   <pic:spPr>
                     <a:xfrm>
                       <a:off x="0" y="0"/>
-                      <a:ext cx="5669280" cy="4091741"/>
+                      <a:ext cx="5669280" cy="4107078"/>
                     </a:xfrm>
                     <a:prstGeom prst="rect"/>
                   </pic:spPr>
@@ -1354,7 +1365,7 @@
       <w:r>
         <w:rPr>
           <w:b/>
-          <w:color w:val="1F497D"/>
+          <w:color w:val="000000"/>
           <w:sz w:val="26"/>
         </w:rPr>
         <w:t>2.3. File dữ liệu: lib/SanPham.txt</w:t>
@@ -1362,13 +1373,13 @@
     </w:p>
     <w:p>
       <w:pPr>
-        <w:spacing w:before="40" w:after="160"/>
+        <w:spacing w:before="40" w:after="120"/>
         <w:jc w:val="center"/>
       </w:pPr>
       <w:r>
         <w:drawing>
           <wp:inline xmlns:a="http://schemas.openxmlformats.org/drawingml/2006/main" xmlns:pic="http://schemas.openxmlformats.org/drawingml/2006/picture">
-            <wp:extent cx="5669280" cy="985962"/>
+            <wp:extent cx="5669280" cy="932281"/>
             <wp:docPr id="7" name="Picture 7"/>
             <wp:cNvGraphicFramePr>
               <a:graphicFrameLocks noChangeAspect="1"/>
@@ -1389,7 +1400,7 @@
                   <pic:spPr>
                     <a:xfrm>
                       <a:off x="0" y="0"/>
-                      <a:ext cx="5669280" cy="985962"/>
+                      <a:ext cx="5669280" cy="932281"/>
                     </a:xfrm>
                     <a:prstGeom prst="rect"/>
                   </pic:spPr>
@@ -1407,7 +1418,7 @@
       <w:r>
         <w:rPr>
           <w:b/>
-          <w:color w:val="1F497D"/>
+          <w:color w:val="000000"/>
           <w:sz w:val="26"/>
         </w:rPr>
         <w:t>2.4. Source Code: bin/ql_san_pham.dart (Chương trình chính)</w:t>
@@ -1415,13 +1426,13 @@
     </w:p>
     <w:p>
       <w:pPr>
-        <w:spacing w:before="40" w:after="160"/>
+        <w:spacing w:before="40" w:after="120"/>
         <w:jc w:val="center"/>
       </w:pPr>
       <w:r>
         <w:drawing>
           <wp:inline xmlns:a="http://schemas.openxmlformats.org/drawingml/2006/main" xmlns:pic="http://schemas.openxmlformats.org/drawingml/2006/picture">
-            <wp:extent cx="5669280" cy="1873327"/>
+            <wp:extent cx="5669280" cy="1839366"/>
             <wp:docPr id="8" name="Picture 8"/>
             <wp:cNvGraphicFramePr>
               <a:graphicFrameLocks noChangeAspect="1"/>
@@ -1442,7 +1453,7 @@
                   <pic:spPr>
                     <a:xfrm>
                       <a:off x="0" y="0"/>
-                      <a:ext cx="5669280" cy="1873327"/>
+                      <a:ext cx="5669280" cy="1839366"/>
                     </a:xfrm>
                     <a:prstGeom prst="rect"/>
                   </pic:spPr>
@@ -1460,7 +1471,7 @@
       <w:r>
         <w:rPr>
           <w:b/>
-          <w:color w:val="1F497D"/>
+          <w:color w:val="000000"/>
           <w:sz w:val="26"/>
         </w:rPr>
         <w:t>2.5. Kết quả thực thi chương trình Bài 2</w:t>
@@ -1468,13 +1479,13 @@
     </w:p>
     <w:p>
       <w:pPr>
-        <w:spacing w:before="40" w:after="160"/>
+        <w:spacing w:before="40" w:after="120"/>
         <w:jc w:val="center"/>
       </w:pPr>
       <w:r>
         <w:drawing>
           <wp:inline xmlns:a="http://schemas.openxmlformats.org/drawingml/2006/main" xmlns:pic="http://schemas.openxmlformats.org/drawingml/2006/picture">
-            <wp:extent cx="5669280" cy="3056481"/>
+            <wp:extent cx="5669280" cy="3048813"/>
             <wp:docPr id="9" name="Picture 9"/>
             <wp:cNvGraphicFramePr>
               <a:graphicFrameLocks noChangeAspect="1"/>
@@ -1495,7 +1506,7 @@
                   <pic:spPr>
                     <a:xfrm>
                       <a:off x="0" y="0"/>
-                      <a:ext cx="5669280" cy="3056481"/>
+                      <a:ext cx="5669280" cy="3048813"/>
                     </a:xfrm>
                     <a:prstGeom prst="rect"/>
                   </pic:spPr>
@@ -1508,24 +1519,25 @@
     </w:p>
     <w:p>
       <w:pPr>
-        <w:spacing w:before="320" w:after="80"/>
+        <w:spacing w:before="280" w:after="80"/>
       </w:pPr>
       <w:r>
         <w:rPr>
           <w:b/>
-          <w:color w:val="003366"/>
-          <w:sz w:val="28"/>
+          <w:color w:val="000000"/>
+          <w:sz w:val="26"/>
         </w:rPr>
         <w:t>III. BÀI TẬP 3: QUẢN LÝ PHÒNG TRỌ (ql_nha_tro – BÀI TẬP TỰ LÀM 1)</w:t>
       </w:r>
     </w:p>
     <w:p>
       <w:pPr>
-        <w:spacing w:before="0" w:after="80"/>
+        <w:spacing w:before="0" w:after="60"/>
       </w:pPr>
       <w:r>
         <w:rPr>
           <w:b/>
+          <w:color w:val="000000"/>
           <w:sz w:val="26"/>
         </w:rPr>
         <w:t xml:space="preserve">• Đường dẫn Git: </w:t>
@@ -1536,7 +1548,7 @@
             <w:rFonts w:ascii="Times New Roman" w:hAnsi="Times New Roman"/>
             <w:sz w:val="26"/>
             <w:szCs w:val="26"/>
-            <w:color w:val="004B87"/>
+            <w:color w:val="000000"/>
             <w:u w:val="single"/>
           </w:rPr>
           <w:t>https://github.com/BaoAnh109/PTUDDD/tree/main/Tuan02/ql_nha_tro</w:t>
@@ -1550,12 +1562,14 @@
       <w:r>
         <w:rPr>
           <w:b/>
+          <w:color w:val="000000"/>
           <w:sz w:val="26"/>
         </w:rPr>
         <w:t xml:space="preserve">• Tóm tắt yêu cầu: </w:t>
       </w:r>
       <w:r>
         <w:rPr>
+          <w:color w:val="000000"/>
           <w:sz w:val="26"/>
         </w:rPr>
         <w:t>Thiết kế lớp trừu tượng Phong và 2 lớp con LoaiPhongA, LoaiPhongB. Đọc dữ liệu từ file phongthue.txt, xuất danh sách phòng, lọc phòng có &gt;= 2 người thuê, tính tổng tiền phòng, sắp xếp theo số điện tiêu thụ và lọc các phòng loại A.</w:t>
@@ -1568,7 +1582,7 @@
       <w:r>
         <w:rPr>
           <w:b/>
-          <w:color w:val="1F497D"/>
+          <w:color w:val="000000"/>
           <w:sz w:val="26"/>
         </w:rPr>
         <w:t>3.1. Source Code: lib/Phong.dart (Lớp trừu tượng Phong)</w:t>
@@ -1576,13 +1590,13 @@
     </w:p>
     <w:p>
       <w:pPr>
-        <w:spacing w:before="40" w:after="160"/>
+        <w:spacing w:before="40" w:after="120"/>
         <w:jc w:val="center"/>
       </w:pPr>
       <w:r>
         <w:drawing>
           <wp:inline xmlns:a="http://schemas.openxmlformats.org/drawingml/2006/main" xmlns:pic="http://schemas.openxmlformats.org/drawingml/2006/picture">
-            <wp:extent cx="5669280" cy="4683318"/>
+            <wp:extent cx="5669280" cy="4711802"/>
             <wp:docPr id="10" name="Picture 10"/>
             <wp:cNvGraphicFramePr>
               <a:graphicFrameLocks noChangeAspect="1"/>
@@ -1603,7 +1617,7 @@
                   <pic:spPr>
                     <a:xfrm>
                       <a:off x="0" y="0"/>
-                      <a:ext cx="5669280" cy="4683318"/>
+                      <a:ext cx="5669280" cy="4711802"/>
                     </a:xfrm>
                     <a:prstGeom prst="rect"/>
                   </pic:spPr>
@@ -1621,7 +1635,7 @@
       <w:r>
         <w:rPr>
           <w:b/>
-          <w:color w:val="1F497D"/>
+          <w:color w:val="000000"/>
           <w:sz w:val="26"/>
         </w:rPr>
         <w:t>3.2. Source Code: lib/LoaiPhong.dart (Lớp LoaiPhongA và LoaiPhongB)</w:t>
@@ -1629,13 +1643,13 @@
     </w:p>
     <w:p>
       <w:pPr>
-        <w:spacing w:before="40" w:after="160"/>
+        <w:spacing w:before="40" w:after="120"/>
         <w:jc w:val="center"/>
       </w:pPr>
       <w:r>
         <w:drawing>
           <wp:inline xmlns:a="http://schemas.openxmlformats.org/drawingml/2006/main" xmlns:pic="http://schemas.openxmlformats.org/drawingml/2006/picture">
-            <wp:extent cx="5669280" cy="10746983"/>
+            <wp:extent cx="5669280" cy="10910214"/>
             <wp:docPr id="11" name="Picture 11"/>
             <wp:cNvGraphicFramePr>
               <a:graphicFrameLocks noChangeAspect="1"/>
@@ -1656,7 +1670,7 @@
                   <pic:spPr>
                     <a:xfrm>
                       <a:off x="0" y="0"/>
-                      <a:ext cx="5669280" cy="10746983"/>
+                      <a:ext cx="5669280" cy="10910214"/>
                     </a:xfrm>
                     <a:prstGeom prst="rect"/>
                   </pic:spPr>
@@ -1674,7 +1688,7 @@
       <w:r>
         <w:rPr>
           <w:b/>
-          <w:color w:val="1F497D"/>
+          <w:color w:val="000000"/>
           <w:sz w:val="26"/>
         </w:rPr>
         <w:t>3.3. Source Code: lib/DocFile.dart (Đọc file phongthue.txt)</w:t>
@@ -1682,13 +1696,13 @@
     </w:p>
     <w:p>
       <w:pPr>
-        <w:spacing w:before="40" w:after="160"/>
+        <w:spacing w:before="40" w:after="120"/>
         <w:jc w:val="center"/>
       </w:pPr>
       <w:r>
         <w:drawing>
           <wp:inline xmlns:a="http://schemas.openxmlformats.org/drawingml/2006/main" xmlns:pic="http://schemas.openxmlformats.org/drawingml/2006/picture">
-            <wp:extent cx="5669280" cy="6162261"/>
+            <wp:extent cx="5669280" cy="6223610"/>
             <wp:docPr id="12" name="Picture 12"/>
             <wp:cNvGraphicFramePr>
               <a:graphicFrameLocks noChangeAspect="1"/>
@@ -1709,7 +1723,7 @@
                   <pic:spPr>
                     <a:xfrm>
                       <a:off x="0" y="0"/>
-                      <a:ext cx="5669280" cy="6162261"/>
+                      <a:ext cx="5669280" cy="6223610"/>
                     </a:xfrm>
                     <a:prstGeom prst="rect"/>
                   </pic:spPr>
@@ -1727,7 +1741,7 @@
       <w:r>
         <w:rPr>
           <w:b/>
-          <w:color w:val="1F497D"/>
+          <w:color w:val="000000"/>
           <w:sz w:val="26"/>
         </w:rPr>
         <w:t>3.4. File dữ liệu: lib/phongthue.txt</w:t>
@@ -1735,13 +1749,13 @@
     </w:p>
     <w:p>
       <w:pPr>
-        <w:spacing w:before="40" w:after="160"/>
+        <w:spacing w:before="40" w:after="120"/>
         <w:jc w:val="center"/>
       </w:pPr>
       <w:r>
         <w:drawing>
           <wp:inline xmlns:a="http://schemas.openxmlformats.org/drawingml/2006/main" xmlns:pic="http://schemas.openxmlformats.org/drawingml/2006/picture">
-            <wp:extent cx="5669280" cy="985962"/>
+            <wp:extent cx="5669280" cy="932281"/>
             <wp:docPr id="13" name="Picture 13"/>
             <wp:cNvGraphicFramePr>
               <a:graphicFrameLocks noChangeAspect="1"/>
@@ -1762,7 +1776,7 @@
                   <pic:spPr>
                     <a:xfrm>
                       <a:off x="0" y="0"/>
-                      <a:ext cx="5669280" cy="985962"/>
+                      <a:ext cx="5669280" cy="932281"/>
                     </a:xfrm>
                     <a:prstGeom prst="rect"/>
                   </pic:spPr>
@@ -1780,7 +1794,7 @@
       <w:r>
         <w:rPr>
           <w:b/>
-          <w:color w:val="1F497D"/>
+          <w:color w:val="000000"/>
           <w:sz w:val="26"/>
         </w:rPr>
         <w:t>3.5. Source Code: bin/ql_nha_tro.dart (Chương trình chính)</w:t>
@@ -1788,13 +1802,13 @@
     </w:p>
     <w:p>
       <w:pPr>
-        <w:spacing w:before="40" w:after="160"/>
+        <w:spacing w:before="40" w:after="120"/>
         <w:jc w:val="center"/>
       </w:pPr>
       <w:r>
         <w:drawing>
           <wp:inline xmlns:a="http://schemas.openxmlformats.org/drawingml/2006/main" xmlns:pic="http://schemas.openxmlformats.org/drawingml/2006/picture">
-            <wp:extent cx="5669280" cy="8972252"/>
+            <wp:extent cx="5669280" cy="9096045"/>
             <wp:docPr id="14" name="Picture 14"/>
             <wp:cNvGraphicFramePr>
               <a:graphicFrameLocks noChangeAspect="1"/>
@@ -1815,7 +1829,7 @@
                   <pic:spPr>
                     <a:xfrm>
                       <a:off x="0" y="0"/>
-                      <a:ext cx="5669280" cy="8972252"/>
+                      <a:ext cx="5669280" cy="9096045"/>
                     </a:xfrm>
                     <a:prstGeom prst="rect"/>
                   </pic:spPr>
@@ -1833,7 +1847,7 @@
       <w:r>
         <w:rPr>
           <w:b/>
-          <w:color w:val="1F497D"/>
+          <w:color w:val="000000"/>
           <w:sz w:val="26"/>
         </w:rPr>
         <w:t>3.6. Kết quả thực thi chương trình Bài 3</w:t>
@@ -1841,13 +1855,13 @@
     </w:p>
     <w:p>
       <w:pPr>
-        <w:spacing w:before="40" w:after="160"/>
+        <w:spacing w:before="40" w:after="120"/>
         <w:jc w:val="center"/>
       </w:pPr>
       <w:r>
         <w:drawing>
           <wp:inline xmlns:a="http://schemas.openxmlformats.org/drawingml/2006/main" xmlns:pic="http://schemas.openxmlformats.org/drawingml/2006/picture">
-            <wp:extent cx="5669280" cy="4239635"/>
+            <wp:extent cx="5669280" cy="4258259"/>
             <wp:docPr id="15" name="Picture 15"/>
             <wp:cNvGraphicFramePr>
               <a:graphicFrameLocks noChangeAspect="1"/>
@@ -1868,7 +1882,7 @@
                   <pic:spPr>
                     <a:xfrm>
                       <a:off x="0" y="0"/>
-                      <a:ext cx="5669280" cy="4239635"/>
+                      <a:ext cx="5669280" cy="4258259"/>
                     </a:xfrm>
                     <a:prstGeom prst="rect"/>
                   </pic:spPr>
@@ -1881,24 +1895,25 @@
     </w:p>
     <w:p>
       <w:pPr>
-        <w:spacing w:before="320" w:after="80"/>
+        <w:spacing w:before="280" w:after="80"/>
       </w:pPr>
       <w:r>
         <w:rPr>
           <w:b/>
-          <w:color w:val="003366"/>
-          <w:sz w:val="28"/>
+          <w:color w:val="000000"/>
+          <w:sz w:val="26"/>
         </w:rPr>
         <w:t>IV. BÀI TẬP 4: QUẢN LÝ MÔN HỌC (ql_mon_hoc – BÀI TẬP TỰ LÀM 2)</w:t>
       </w:r>
     </w:p>
     <w:p>
       <w:pPr>
-        <w:spacing w:before="0" w:after="80"/>
+        <w:spacing w:before="0" w:after="60"/>
       </w:pPr>
       <w:r>
         <w:rPr>
           <w:b/>
+          <w:color w:val="000000"/>
           <w:sz w:val="26"/>
         </w:rPr>
         <w:t xml:space="preserve">• Đường dẫn Git: </w:t>
@@ -1909,7 +1924,7 @@
             <w:rFonts w:ascii="Times New Roman" w:hAnsi="Times New Roman"/>
             <w:sz w:val="26"/>
             <w:szCs w:val="26"/>
-            <w:color w:val="004B87"/>
+            <w:color w:val="000000"/>
             <w:u w:val="single"/>
           </w:rPr>
           <w:t>https://github.com/BaoAnh109/PTUDDD/tree/main/Tuan02/ql_mon_hoc</w:t>
@@ -1923,12 +1938,14 @@
       <w:r>
         <w:rPr>
           <w:b/>
+          <w:color w:val="000000"/>
           <w:sz w:val="26"/>
         </w:rPr>
         <w:t xml:space="preserve">• Tóm tắt yêu cầu: </w:t>
       </w:r>
       <w:r>
         <w:rPr>
+          <w:color w:val="000000"/>
           <w:sz w:val="26"/>
         </w:rPr>
         <w:t>Xây dựng hệ thống tính điểm trung bình cho 3 loại môn học: Lý thuyết, Thực hành, Đồ án. Nhập dữ liệu từ bàn phím, kiểm tra danh sách có sắp xếp theo tên hay không, sắp xếp theo số tín chỉ, tìm môn có số tín chỉ cao nhất, tìm kiếm theo tên và đọc dữ liệu từ file MonHoc.txt.</w:t>
@@ -1941,7 +1958,7 @@
       <w:r>
         <w:rPr>
           <w:b/>
-          <w:color w:val="1F497D"/>
+          <w:color w:val="000000"/>
           <w:sz w:val="26"/>
         </w:rPr>
         <w:t>4.1. Source Code: lib/MonHoc.dart (Lớp trừu tượng MonHoc)</w:t>
@@ -1949,13 +1966,13 @@
     </w:p>
     <w:p>
       <w:pPr>
-        <w:spacing w:before="40" w:after="160"/>
+        <w:spacing w:before="40" w:after="120"/>
         <w:jc w:val="center"/>
       </w:pPr>
       <w:r>
         <w:drawing>
           <wp:inline xmlns:a="http://schemas.openxmlformats.org/drawingml/2006/main" xmlns:pic="http://schemas.openxmlformats.org/drawingml/2006/picture">
-            <wp:extent cx="5669280" cy="3795953"/>
+            <wp:extent cx="5669280" cy="3804717"/>
             <wp:docPr id="16" name="Picture 16"/>
             <wp:cNvGraphicFramePr>
               <a:graphicFrameLocks noChangeAspect="1"/>
@@ -1976,7 +1993,7 @@
                   <pic:spPr>
                     <a:xfrm>
                       <a:off x="0" y="0"/>
-                      <a:ext cx="5669280" cy="3795953"/>
+                      <a:ext cx="5669280" cy="3804717"/>
                     </a:xfrm>
                     <a:prstGeom prst="rect"/>
                   </pic:spPr>
@@ -1994,7 +2011,7 @@
       <w:r>
         <w:rPr>
           <w:b/>
-          <w:color w:val="1F497D"/>
+          <w:color w:val="000000"/>
           <w:sz w:val="26"/>
         </w:rPr>
         <w:t>4.2. Source Code: lib/Loai.dart (Lớp LyThuyet, ThucHanh, DoAn)</w:t>
@@ -2002,13 +2019,13 @@
     </w:p>
     <w:p>
       <w:pPr>
-        <w:spacing w:before="40" w:after="160"/>
+        <w:spacing w:before="40" w:after="120"/>
         <w:jc w:val="center"/>
       </w:pPr>
       <w:r>
         <w:drawing>
           <wp:inline xmlns:a="http://schemas.openxmlformats.org/drawingml/2006/main" xmlns:pic="http://schemas.openxmlformats.org/drawingml/2006/picture">
-            <wp:extent cx="5669280" cy="10894877"/>
+            <wp:extent cx="5669280" cy="11061395"/>
             <wp:docPr id="17" name="Picture 17"/>
             <wp:cNvGraphicFramePr>
               <a:graphicFrameLocks noChangeAspect="1"/>
@@ -2029,7 +2046,7 @@
                   <pic:spPr>
                     <a:xfrm>
                       <a:off x="0" y="0"/>
-                      <a:ext cx="5669280" cy="10894877"/>
+                      <a:ext cx="5669280" cy="11061395"/>
                     </a:xfrm>
                     <a:prstGeom prst="rect"/>
                   </pic:spPr>
@@ -2047,7 +2064,7 @@
       <w:r>
         <w:rPr>
           <w:b/>
-          <w:color w:val="1F497D"/>
+          <w:color w:val="000000"/>
           <w:sz w:val="26"/>
         </w:rPr>
         <w:t>4.3. Source Code: lib/DocFile.dart (Đọc file MonHoc.txt)</w:t>
@@ -2055,13 +2072,13 @@
     </w:p>
     <w:p>
       <w:pPr>
-        <w:spacing w:before="40" w:after="160"/>
+        <w:spacing w:before="40" w:after="120"/>
         <w:jc w:val="center"/>
       </w:pPr>
       <w:r>
         <w:drawing>
           <wp:inline xmlns:a="http://schemas.openxmlformats.org/drawingml/2006/main" xmlns:pic="http://schemas.openxmlformats.org/drawingml/2006/picture">
-            <wp:extent cx="5669280" cy="7641203"/>
+            <wp:extent cx="5669280" cy="7735418"/>
             <wp:docPr id="18" name="Picture 18"/>
             <wp:cNvGraphicFramePr>
               <a:graphicFrameLocks noChangeAspect="1"/>
@@ -2082,7 +2099,7 @@
                   <pic:spPr>
                     <a:xfrm>
                       <a:off x="0" y="0"/>
-                      <a:ext cx="5669280" cy="7641203"/>
+                      <a:ext cx="5669280" cy="7735418"/>
                     </a:xfrm>
                     <a:prstGeom prst="rect"/>
                   </pic:spPr>
@@ -2100,7 +2117,7 @@
       <w:r>
         <w:rPr>
           <w:b/>
-          <w:color w:val="1F497D"/>
+          <w:color w:val="000000"/>
           <w:sz w:val="26"/>
         </w:rPr>
         <w:t>4.4. File dữ liệu: lib/MonHoc.txt</w:t>
@@ -2108,13 +2125,13 @@
     </w:p>
     <w:p>
       <w:pPr>
-        <w:spacing w:before="40" w:after="160"/>
+        <w:spacing w:before="40" w:after="120"/>
         <w:jc w:val="center"/>
       </w:pPr>
       <w:r>
         <w:drawing>
           <wp:inline xmlns:a="http://schemas.openxmlformats.org/drawingml/2006/main" xmlns:pic="http://schemas.openxmlformats.org/drawingml/2006/picture">
-            <wp:extent cx="5669280" cy="1873327"/>
+            <wp:extent cx="5669280" cy="1839366"/>
             <wp:docPr id="19" name="Picture 19"/>
             <wp:cNvGraphicFramePr>
               <a:graphicFrameLocks noChangeAspect="1"/>
@@ -2135,7 +2152,7 @@
                   <pic:spPr>
                     <a:xfrm>
                       <a:off x="0" y="0"/>
-                      <a:ext cx="5669280" cy="1873327"/>
+                      <a:ext cx="5669280" cy="1839366"/>
                     </a:xfrm>
                     <a:prstGeom prst="rect"/>
                   </pic:spPr>
@@ -2153,7 +2170,7 @@
       <w:r>
         <w:rPr>
           <w:b/>
-          <w:color w:val="1F497D"/>
+          <w:color w:val="000000"/>
           <w:sz w:val="26"/>
         </w:rPr>
         <w:t>4.5. Source Code: bin/ql_mon_hoc.dart (Chương trình chính)</w:t>
@@ -2161,13 +2178,13 @@
     </w:p>
     <w:p>
       <w:pPr>
-        <w:spacing w:before="40" w:after="160"/>
+        <w:spacing w:before="40" w:after="120"/>
         <w:jc w:val="center"/>
       </w:pPr>
       <w:r>
         <w:drawing>
           <wp:inline xmlns:a="http://schemas.openxmlformats.org/drawingml/2006/main" xmlns:pic="http://schemas.openxmlformats.org/drawingml/2006/picture">
-            <wp:extent cx="5669280" cy="21395370"/>
+            <wp:extent cx="5669280" cy="21795232"/>
             <wp:docPr id="20" name="Picture 20"/>
             <wp:cNvGraphicFramePr>
               <a:graphicFrameLocks noChangeAspect="1"/>
@@ -2188,7 +2205,7 @@
                   <pic:spPr>
                     <a:xfrm>
                       <a:off x="0" y="0"/>
-                      <a:ext cx="5669280" cy="21395370"/>
+                      <a:ext cx="5669280" cy="21795232"/>
                     </a:xfrm>
                     <a:prstGeom prst="rect"/>
                   </pic:spPr>
@@ -2206,7 +2223,7 @@
       <w:r>
         <w:rPr>
           <w:b/>
-          <w:color w:val="1F497D"/>
+          <w:color w:val="000000"/>
           <w:sz w:val="26"/>
         </w:rPr>
         <w:t>4.6. Kết quả thực thi chương trình Bài 4</w:t>
@@ -2214,13 +2231,13 @@
     </w:p>
     <w:p>
       <w:pPr>
-        <w:spacing w:before="40" w:after="160"/>
+        <w:spacing w:before="40" w:after="120"/>
         <w:jc w:val="center"/>
       </w:pPr>
       <w:r>
         <w:drawing>
           <wp:inline xmlns:a="http://schemas.openxmlformats.org/drawingml/2006/main" xmlns:pic="http://schemas.openxmlformats.org/drawingml/2006/picture">
-            <wp:extent cx="5669280" cy="5411026"/>
+            <wp:extent cx="5669280" cy="5360496"/>
             <wp:docPr id="21" name="Picture 21"/>
             <wp:cNvGraphicFramePr>
               <a:graphicFrameLocks noChangeAspect="1"/>
@@ -2241,7 +2258,7 @@
                   <pic:spPr>
                     <a:xfrm>
                       <a:off x="0" y="0"/>
-                      <a:ext cx="5669280" cy="5411026"/>
+                      <a:ext cx="5669280" cy="5360496"/>
                     </a:xfrm>
                     <a:prstGeom prst="rect"/>
                   </pic:spPr>
@@ -2254,24 +2271,25 @@
     </w:p>
     <w:p>
       <w:pPr>
-        <w:spacing w:before="320" w:after="80"/>
+        <w:spacing w:before="280" w:after="80"/>
       </w:pPr>
       <w:r>
         <w:rPr>
           <w:b/>
-          <w:color w:val="003366"/>
-          <w:sz w:val="28"/>
+          <w:color w:val="000000"/>
+          <w:sz w:val="26"/>
         </w:rPr>
         <w:t>V. BÀI TẬP 5: QUẢN LÝ HÓA ĐƠN CÔNG TY ABC (ql_congty_abc – BÀI TẬP VỀ NHÀ)</w:t>
       </w:r>
     </w:p>
     <w:p>
       <w:pPr>
-        <w:spacing w:before="0" w:after="80"/>
+        <w:spacing w:before="0" w:after="60"/>
       </w:pPr>
       <w:r>
         <w:rPr>
           <w:b/>
+          <w:color w:val="000000"/>
           <w:sz w:val="26"/>
         </w:rPr>
         <w:t xml:space="preserve">• Đường dẫn Git: </w:t>
@@ -2282,7 +2300,7 @@
             <w:rFonts w:ascii="Times New Roman" w:hAnsi="Times New Roman"/>
             <w:sz w:val="26"/>
             <w:szCs w:val="26"/>
-            <w:color w:val="004B87"/>
+            <w:color w:val="000000"/>
             <w:u w:val="single"/>
           </w:rPr>
           <w:t>https://github.com/BaoAnh109/PTUDDD/tree/main/Tuan02/ql_congty_abc</w:t>
@@ -2296,12 +2314,14 @@
       <w:r>
         <w:rPr>
           <w:b/>
+          <w:color w:val="000000"/>
           <w:sz w:val="26"/>
         </w:rPr>
         <w:t xml:space="preserve">• Tóm tắt yêu cầu: </w:t>
       </w:r>
       <w:r>
         <w:rPr>
+          <w:color w:val="000000"/>
           <w:sz w:val="26"/>
         </w:rPr>
         <w:t>Xây dựng hệ thống quản lý hóa đơn phân phối máy lạnh ABC với các đối tượng: Khách hàng cá nhân, Đại lý cấp 1, Khách hàng công ty. Kiểm tra ràng buộc mã KH (KHxxxx), tính chiết khấu theo chính sách, trợ giá kích cầu, thuế VAT 10%, quản lý danh sách bằng menu hướng đối tượng đầy đủ các chức năng (nhập, xuất, tổng thành tiền, tổng trợ giá, KH mua nhiều nhất, chiết khấu công ty, sắp xếp, tìm kiếm mã KH).</w:t>
@@ -2314,7 +2334,7 @@
       <w:r>
         <w:rPr>
           <w:b/>
-          <w:color w:val="1F497D"/>
+          <w:color w:val="000000"/>
           <w:sz w:val="26"/>
         </w:rPr>
         <w:t>5.1. Source Code: lib/HoaDon.dart (Lớp trừu tượng HoaDon)</w:t>
@@ -2322,13 +2342,13 @@
     </w:p>
     <w:p>
       <w:pPr>
-        <w:spacing w:before="40" w:after="160"/>
+        <w:spacing w:before="40" w:after="120"/>
         <w:jc w:val="center"/>
       </w:pPr>
       <w:r>
         <w:drawing>
           <wp:inline xmlns:a="http://schemas.openxmlformats.org/drawingml/2006/main" xmlns:pic="http://schemas.openxmlformats.org/drawingml/2006/picture">
-            <wp:extent cx="5669280" cy="7487391"/>
+            <wp:extent cx="5669280" cy="7480926"/>
             <wp:docPr id="22" name="Picture 22"/>
             <wp:cNvGraphicFramePr>
               <a:graphicFrameLocks noChangeAspect="1"/>
@@ -2349,7 +2369,7 @@
                   <pic:spPr>
                     <a:xfrm>
                       <a:off x="0" y="0"/>
-                      <a:ext cx="5669280" cy="7487391"/>
+                      <a:ext cx="5669280" cy="7480926"/>
                     </a:xfrm>
                     <a:prstGeom prst="rect"/>
                   </pic:spPr>
@@ -2367,7 +2387,7 @@
       <w:r>
         <w:rPr>
           <w:b/>
-          <w:color w:val="1F497D"/>
+          <w:color w:val="000000"/>
           <w:sz w:val="26"/>
         </w:rPr>
         <w:t>5.2. Source Code: lib/LoaiHD.dart (HoaDonCaNhan, HoaDonDaiLy, HoaDonCongTy)</w:t>
@@ -2375,13 +2395,13 @@
     </w:p>
     <w:p>
       <w:pPr>
-        <w:spacing w:before="40" w:after="160"/>
+        <w:spacing w:before="40" w:after="120"/>
         <w:jc w:val="center"/>
       </w:pPr>
       <w:r>
         <w:drawing>
           <wp:inline xmlns:a="http://schemas.openxmlformats.org/drawingml/2006/main" xmlns:pic="http://schemas.openxmlformats.org/drawingml/2006/picture">
-            <wp:extent cx="5669280" cy="15775388"/>
+            <wp:extent cx="5669280" cy="16050361"/>
             <wp:docPr id="23" name="Picture 23"/>
             <wp:cNvGraphicFramePr>
               <a:graphicFrameLocks noChangeAspect="1"/>
@@ -2402,7 +2422,7 @@
                   <pic:spPr>
                     <a:xfrm>
                       <a:off x="0" y="0"/>
-                      <a:ext cx="5669280" cy="15775388"/>
+                      <a:ext cx="5669280" cy="16050361"/>
                     </a:xfrm>
                     <a:prstGeom prst="rect"/>
                   </pic:spPr>
@@ -2420,7 +2440,7 @@
       <w:r>
         <w:rPr>
           <w:b/>
-          <w:color w:val="1F497D"/>
+          <w:color w:val="000000"/>
           <w:sz w:val="26"/>
         </w:rPr>
         <w:t>5.3. Source Code: lib/QLHoaDon.dart (Lớp quản lý QuanLyHoaDon)</w:t>
@@ -2428,13 +2448,13 @@
     </w:p>
     <w:p>
       <w:pPr>
-        <w:spacing w:before="40" w:after="160"/>
+        <w:spacing w:before="40" w:after="120"/>
         <w:jc w:val="center"/>
       </w:pPr>
       <w:r>
         <w:drawing>
           <wp:inline xmlns:a="http://schemas.openxmlformats.org/drawingml/2006/main" xmlns:pic="http://schemas.openxmlformats.org/drawingml/2006/picture">
-            <wp:extent cx="5669280" cy="21099581"/>
+            <wp:extent cx="5669280" cy="21492870"/>
             <wp:docPr id="24" name="Picture 24"/>
             <wp:cNvGraphicFramePr>
               <a:graphicFrameLocks noChangeAspect="1"/>
@@ -2455,7 +2475,7 @@
                   <pic:spPr>
                     <a:xfrm>
                       <a:off x="0" y="0"/>
-                      <a:ext cx="5669280" cy="21099581"/>
+                      <a:ext cx="5669280" cy="21492870"/>
                     </a:xfrm>
                     <a:prstGeom prst="rect"/>
                   </pic:spPr>
@@ -2473,7 +2493,7 @@
       <w:r>
         <w:rPr>
           <w:b/>
-          <w:color w:val="1F497D"/>
+          <w:color w:val="000000"/>
           <w:sz w:val="26"/>
         </w:rPr>
         <w:t>5.4. File dữ liệu: hoa_don.txt</w:t>
@@ -2481,13 +2501,13 @@
     </w:p>
     <w:p>
       <w:pPr>
-        <w:spacing w:before="40" w:after="160"/>
+        <w:spacing w:before="40" w:after="120"/>
         <w:jc w:val="center"/>
       </w:pPr>
       <w:r>
         <w:drawing>
           <wp:inline xmlns:a="http://schemas.openxmlformats.org/drawingml/2006/main" xmlns:pic="http://schemas.openxmlformats.org/drawingml/2006/picture">
-            <wp:extent cx="5669280" cy="2021222"/>
+            <wp:extent cx="5669280" cy="1990547"/>
             <wp:docPr id="25" name="Picture 25"/>
             <wp:cNvGraphicFramePr>
               <a:graphicFrameLocks noChangeAspect="1"/>
@@ -2508,7 +2528,7 @@
                   <pic:spPr>
                     <a:xfrm>
                       <a:off x="0" y="0"/>
-                      <a:ext cx="5669280" cy="2021222"/>
+                      <a:ext cx="5669280" cy="1990547"/>
                     </a:xfrm>
                     <a:prstGeom prst="rect"/>
                   </pic:spPr>
@@ -2526,7 +2546,7 @@
       <w:r>
         <w:rPr>
           <w:b/>
-          <w:color w:val="1F497D"/>
+          <w:color w:val="000000"/>
           <w:sz w:val="26"/>
         </w:rPr>
         <w:t>5.5. Source Code: bin/ql_congty_abc.dart (Menu chương trình chính)</w:t>
@@ -2534,13 +2554,13 @@
     </w:p>
     <w:p>
       <w:pPr>
-        <w:spacing w:before="40" w:after="160"/>
+        <w:spacing w:before="40" w:after="120"/>
         <w:jc w:val="center"/>
       </w:pPr>
       <w:r>
         <w:drawing>
           <wp:inline xmlns:a="http://schemas.openxmlformats.org/drawingml/2006/main" xmlns:pic="http://schemas.openxmlformats.org/drawingml/2006/picture">
-            <wp:extent cx="5669280" cy="9711723"/>
+            <wp:extent cx="5669280" cy="9851949"/>
             <wp:docPr id="26" name="Picture 26"/>
             <wp:cNvGraphicFramePr>
               <a:graphicFrameLocks noChangeAspect="1"/>
@@ -2561,7 +2581,7 @@
                   <pic:spPr>
                     <a:xfrm>
                       <a:off x="0" y="0"/>
-                      <a:ext cx="5669280" cy="9711723"/>
+                      <a:ext cx="5669280" cy="9851949"/>
                     </a:xfrm>
                     <a:prstGeom prst="rect"/>
                   </pic:spPr>
@@ -2579,7 +2599,7 @@
       <w:r>
         <w:rPr>
           <w:b/>
-          <w:color w:val="1F497D"/>
+          <w:color w:val="000000"/>
           <w:sz w:val="26"/>
         </w:rPr>
         <w:t>5.6. Kết quả thực thi chương trình Bài 5</w:t>
@@ -2587,13 +2607,13 @@
     </w:p>
     <w:p>
       <w:pPr>
-        <w:spacing w:before="40" w:after="160"/>
+        <w:spacing w:before="40" w:after="120"/>
         <w:jc w:val="center"/>
       </w:pPr>
       <w:r>
         <w:drawing>
           <wp:inline xmlns:a="http://schemas.openxmlformats.org/drawingml/2006/main" xmlns:pic="http://schemas.openxmlformats.org/drawingml/2006/picture">
-            <wp:extent cx="5669280" cy="3707963"/>
+            <wp:extent cx="5669280" cy="3662022"/>
             <wp:docPr id="27" name="Picture 27"/>
             <wp:cNvGraphicFramePr>
               <a:graphicFrameLocks noChangeAspect="1"/>
@@ -2614,7 +2634,7 @@
                   <pic:spPr>
                     <a:xfrm>
                       <a:off x="0" y="0"/>
-                      <a:ext cx="5669280" cy="3707963"/>
+                      <a:ext cx="5669280" cy="3662022"/>
                     </a:xfrm>
                     <a:prstGeom prst="rect"/>
                   </pic:spPr>

</xml_diff>